<commit_message>
Revise research RRL with academic foundations, related-system synthesis and references
</commit_message>
<xml_diff>
--- a/research/Hameem_Abdulhakim_Sako_Supply_Chapters_1-3.docx
+++ b/research/Hameem_Abdulhakim_Sako_Supply_Chapters_1-3.docx
@@ -144,6 +144,14 @@
       </w:pPr>
       <w:r>
         <w:t>No interview transcripts, survey responses, signed evaluation forms, or verified partner-store information were supplied for this draft. Consequently, field requirements gathering and user evaluation are presented as planned procedures. The researcher must replace the course/year, adviser, study locale, schedule, and any empirical evidence placeholders before treating the document as a final submission.</w:t>
+      </w:r>
+    </w:p>
+    <w:p>
+      <w:pPr>
+        <w:jc w:val="both"/>
+      </w:pPr>
+      <w:r>
+        <w:t>RRL revision note — October 26, 2026: Section 1.7 and the References have been revised. The RRL uses implementation checkpoint 281bf78 for current feature descriptions. Other chapters retain the original draft’s October 24 implementation snapshot; their older map, email, scope and future-work statements must be aligned separately before final submission. Changes made only in the researcher’s local Word copy, including dates or school letterhead, were not available in this workspace.</w:t>
       </w:r>
     </w:p>
     <w:p>
@@ -860,7 +868,7 @@
         <w:pStyle w:val="Heading2"/>
       </w:pPr>
       <w:r>
-        <w:t>1.7 Review of Related Literature and Existing Systems</w:t>
+        <w:t>1.7 Review of Related Literature (RRL)</w:t>
       </w:r>
     </w:p>
     <w:p>
@@ -868,31 +876,31 @@
         <w:jc w:val="both"/>
       </w:pPr>
       <w:r>
-        <w:t>This section reviews four documented existing systems and supporting technical guidance. It is a documentary comparison, not a hands-on benchmark or a claim that the researcher has conducted empirical studies of these products. Official project material was used to establish general capabilities. No local thesis, interview finding, or statistical result is invented to fill a literature requirement.</w:t>
+        <w:t>This section examines literature and existing systems relevant to the development of Sako Supply, a web-based wholesale rice ordering and inventory management system. The review focuses on information-system quality, technology acceptance, trust in online transactions, inventory accuracy, and the integration of customer and administrative processes. These topics provide a basis for explaining the system’s design and identifying appropriate areas for evaluation.</w:t>
       </w:r>
     </w:p>
     <w:p>
       <w:pPr>
-        <w:pStyle w:val="Heading3"/>
+        <w:jc w:val="both"/>
       </w:pPr>
       <w:r>
-        <w:t>1.7.1 WooCommerce</w:t>
+        <w:t>The academic literature provides conceptual and empirical foundations, while the related systems illustrate established approaches to electronic commerce and inventory management. These sources serve different purposes: software documentation describes product capabilities, whereas scholarly literature helps explain the principles underlying system development and evaluation. Their relevance to Sako Supply is discussed without assuming that findings from other settings automatically apply to a Philippine bigasan.</w:t>
       </w:r>
     </w:p>
     <w:p>
       <w:pPr>
-        <w:jc w:val="both"/>
+        <w:pStyle w:val="Heading3"/>
       </w:pPr>
       <w:r>
-        <w:t>WooCommerce describes an open-source commerce platform for WordPress with customizable storefronts, product pages, shopping-cart experiences, and optional payment and delivery integrations. Its official product readme also describes administrative performance monitoring and extension-based customization (WooCommerce, n.d.). The relevance to Sako Supply is the connection between product presentation, checkout, and store management. Sako Supply uses a smaller custom implementation for a predefined 25 kg rice workflow rather than implementing the full WordPress and extension ecosystem.</w:t>
+        <w:t>1.7.1 Information-System Quality and Success</w:t>
       </w:r>
     </w:p>
     <w:p>
       <w:pPr>
-        <w:pStyle w:val="Heading3"/>
+        <w:jc w:val="both"/>
       </w:pPr>
       <w:r>
-        <w:t>1.7.2 Odoo</w:t>
+        <w:t>DeLone and McLean (2003) presented an updated model of information-system success that considers system quality, information quality, service quality, use or intention to use, user satisfaction, and net benefits. Their model provides a basis for evaluating an information system beyond the presence of its features. A system may contain the required functions, but its usefulness also depends on the reliability of its operation, the quality of the information it provides, and the experience of its users.</w:t>
       </w:r>
     </w:p>
     <w:p>
@@ -900,31 +908,31 @@
         <w:jc w:val="both"/>
       </w:pPr>
       <w:r>
-        <w:t>Odoo presents a suite of web-based business applications that includes e-commerce, warehouse management, accounting, and point of sale. Its official repository explains that applications can operate separately or be integrated into an ERP arrangement (Odoo S.A., n.d.). This supports the principle that customer-facing and administrative processes can share consistent business data. Sako Supply adopts that integration principle at prototype scale while excluding the broader accounting, personnel, and multi-application scope.</w:t>
+        <w:t>For Sako Supply, system quality is relevant to the operation of registration, checkout, inventory reservation, order processing, and administrative reporting. Information quality concerns the accuracy and clarity of product descriptions, available stock, prices, delivery charges, order statuses, and transaction records. User satisfaction concerns whether customers and administrators consider these functions understandable and helpful in completing their tasks.</w:t>
       </w:r>
     </w:p>
     <w:p>
       <w:pPr>
-        <w:pStyle w:val="Heading3"/>
+        <w:jc w:val="both"/>
       </w:pPr>
       <w:r>
-        <w:t>1.7.3 ERPNext</w:t>
+        <w:t>This literature supports the inclusion of both technical verification and user evaluation in the study. Technical tests can establish whether a particular function behaves as specified, while task-based evaluation can examine whether intended users understand and complete the workflow. However, successful technical tests alone do not establish user satisfaction or business benefits. Claims about improved efficiency, reduced errors, or customer satisfaction require evidence from the study’s own evaluation.</w:t>
       </w:r>
     </w:p>
     <w:p>
       <w:pPr>
-        <w:jc w:val="both"/>
+        <w:pStyle w:val="Heading3"/>
       </w:pPr>
       <w:r>
-        <w:t>ERPNext identifies accounting and order management among its major features. Its order-management description includes tracking inventory, replenishing stock, managing sales orders, and coordinating fulfillment (Frappe Technologies, n.d.). These functions are directly relevant to the relationship between stock availability and customer orders. In Sako Supply, the related functions are limited to stock reservation, adjustment history, order-status progression, and a recorded cash ledger; they do not constitute a complete ERP or accounting system.</w:t>
+        <w:t>1.7.2 Perceived Usefulness and Ease of Use</w:t>
       </w:r>
     </w:p>
     <w:p>
       <w:pPr>
-        <w:pStyle w:val="Heading3"/>
+        <w:jc w:val="both"/>
       </w:pPr>
       <w:r>
-        <w:t>1.7.4 Medusa</w:t>
+        <w:t>Davis (1989) identified perceived usefulness and perceived ease of use as important constructs in technology acceptance. Perceived usefulness concerns whether a person believes that a system can improve task performance. Perceived ease of use concerns whether the person believes that using the system requires relatively little effort. These concepts provide a foundation for examining whether a system is both relevant to users’ needs and manageable to operate.</w:t>
       </w:r>
     </w:p>
     <w:p>
@@ -932,7 +940,183 @@
         <w:jc w:val="both"/>
       </w:pPr>
       <w:r>
-        <w:t>Medusa describes a modular commerce platform that can support business-to-business stores and distributor applications through commerce primitives such as products, carts, orders, pricing, and payments. Its repository separates core modules, API routes, and infrastructure providers (Medusa, n.d.). This supports the architectural choice to separate Sako Supply’s account, order, catalog, pricing, and reporting responsibilities. It does not imply that the prototype reproduces Medusa’s production integrations or enterprise functions.</w:t>
+        <w:t>In the context of Sako Supply, perceived usefulness relates to functions such as viewing rice availability, calculating wholesale prices, maintaining order records, printing receipts, and monitoring inventory. Perceived ease of use relates to the clarity of navigation, the readability of product information, the organization of forms, and the number of steps required to complete an order.</w:t>
+      </w:r>
+    </w:p>
+    <w:p>
+      <w:pPr>
+        <w:jc w:val="both"/>
+      </w:pPr>
+      <w:r>
+        <w:t>These concepts support the use of a simple interface and a consistent customer workflow. For example, the final order-review screen allows customers to check quantities, delivery details, discounts, and the total before submission. Password visibility controls, clear validation messages, and back-to-top buttons can also help users navigate and complete forms. Nevertheless, the presence of these features does not prove that users find the website easy to use. Chapter II should translate usefulness and ease of use into appropriate evaluation questions and observable tasks. Any questionnaire adapted from technology-acceptance literature should be identified as an adapted instrument and reviewed for suitability to the study.</w:t>
+      </w:r>
+    </w:p>
+    <w:p>
+      <w:pPr>
+        <w:pStyle w:val="Heading3"/>
+      </w:pPr>
+      <w:r>
+        <w:t>1.7.3 Trust in Online Shopping</w:t>
+      </w:r>
+    </w:p>
+    <w:p>
+      <w:pPr>
+        <w:jc w:val="both"/>
+      </w:pPr>
+      <w:r>
+        <w:t>Gefen et al. (2003) integrated trust with the Technology Acceptance Model in examining online shopping. Their work provides a basis for considering trust alongside usefulness and ease of use when studying customer interaction with an online store. This is relevant because customers must make decisions using information presented through a website rather than through direct interaction with a seller.</w:t>
+      </w:r>
+    </w:p>
+    <w:p>
+      <w:pPr>
+        <w:jc w:val="both"/>
+      </w:pPr>
+      <w:r>
+        <w:t>For Sako Supply, trust-related design considerations include understandable prices, visible stock information, clear delivery charges, accessible policies, account-specific order records, and accurate descriptions of payment and tracking capabilities. Customers should be able to distinguish between an actual completed transaction, a pending order, and a demonstration of a payment process.</w:t>
+      </w:r>
+    </w:p>
+    <w:p>
+      <w:pPr>
+        <w:jc w:val="both"/>
+      </w:pPr>
+      <w:r>
+        <w:t>The website therefore provides an order summary, a User Agreement, a Privacy Policy, and explanations of its payment limitations. GCash, Maya, and card payments remain demonstrations without real financial transfers. Driver tracking, in contrast, displays device locations only when an assigned driver explicitly shares them. Clear distinctions between these functions help avoid misleading representations of the system. However, these design measures should not be described as proof that customer trust has increased. The study must obtain its own evidence if it intends to make conclusions about trust among its intended users. The literature provides a reason to evaluate transparency and clarity; it does not establish the attitudes of Sako Supply’s customers.</w:t>
+      </w:r>
+    </w:p>
+    <w:p>
+      <w:pPr>
+        <w:pStyle w:val="Heading3"/>
+      </w:pPr>
+      <w:r>
+        <w:t>1.7.4 Inventory Accuracy and Order Management</w:t>
+      </w:r>
+    </w:p>
+    <w:p>
+      <w:pPr>
+        <w:jc w:val="both"/>
+      </w:pPr>
+      <w:r>
+        <w:t>DeHoratius and Raman (2008) examined inventory-record inaccuracy in a retail setting. Their study is relevant to the distinction between inventory recorded in an information system and inventory physically available in a store. This distinction matters because an ordering system depends on stock records when determining whether a customer’s requested quantity can be supplied.</w:t>
+      </w:r>
+    </w:p>
+    <w:p>
+      <w:pPr>
+        <w:jc w:val="both"/>
+      </w:pPr>
+      <w:r>
+        <w:t>For a rice wholesale store, differences between recorded and actual stock may affect order acceptance, purchasing decisions, and customer communication. Sako Supply addresses the consistency of its recorded inventory through server-side stock validation, database transactions, stock-movement records, and controlled cancellation procedures. When an order is accepted, the system reserves the requested quantities. When an eligible order is cancelled or an unpaid Pending reservation expires, the reserved quantities are restored. Delivery-slot capacity is also checked during order creation to prevent conflicting bookings beyond the configured limit.</w:t>
+      </w:r>
+    </w:p>
+    <w:p>
+      <w:pPr>
+        <w:jc w:val="both"/>
+      </w:pPr>
+      <w:r>
+        <w:t>These controls address specific software behaviors, but they do not guarantee that database quantities match the sacks physically present in the store. Physical counting, accurate stock adjustments, and responsible administrative procedures remain necessary. Accordingly, the system’s concurrency and stock-restoration tests should be interpreted as evidence of recorded-inventory consistency under the tested conditions, rather than as proof of complete physical inventory accuracy.</w:t>
+      </w:r>
+    </w:p>
+    <w:p>
+      <w:pPr>
+        <w:pStyle w:val="Heading3"/>
+      </w:pPr>
+      <w:r>
+        <w:t>1.7.5 Related Systems</w:t>
+      </w:r>
+    </w:p>
+    <w:p>
+      <w:pPr>
+        <w:pStyle w:val="Heading3"/>
+      </w:pPr>
+      <w:r>
+        <w:t>WooCommerce</w:t>
+      </w:r>
+    </w:p>
+    <w:p>
+      <w:pPr>
+        <w:jc w:val="both"/>
+      </w:pPr>
+      <w:r>
+        <w:t>WooCommerce is an open-source commerce platform for WordPress. Its official documentation describes capabilities related to storefront presentation, product management, shopping carts, checkout, and extension-based customization (WooCommerce, n.d.). These capabilities illustrate how customer-facing product information can be connected to an ordering process.</w:t>
+      </w:r>
+    </w:p>
+    <w:p>
+      <w:pPr>
+        <w:jc w:val="both"/>
+      </w:pPr>
+      <w:r>
+        <w:t>WooCommerce is relevant to Sako Supply because both systems organize products, quantities, prices, and customer orders within an online storefront. The comparison supports the importance of a clear catalog-to-checkout workflow and the connection between customer purchases and store administration. The difference concerns the scope and implementation of the present study. Sako Supply is a custom academic prototype focused on a single bigasan selling 25 kg rice sacks. Its wholesale rules include configurable minimum quantities, mixed-product bulk discounts, delivery-zone charges, and stock reservations. These differences do not imply that WooCommerce cannot support a rice store; similar requirements may be addressed through configuration or customization.</w:t>
+      </w:r>
+    </w:p>
+    <w:p>
+      <w:pPr>
+        <w:pStyle w:val="Heading3"/>
+      </w:pPr>
+      <w:r>
+        <w:t>Odoo</w:t>
+      </w:r>
+    </w:p>
+    <w:p>
+      <w:pPr>
+        <w:jc w:val="both"/>
+      </w:pPr>
+      <w:r>
+        <w:t>Odoo describes a suite of web-based business applications that includes electronic commerce, inventory or warehouse management, accounting, and point of sale. Its applications can operate individually or as part of an integrated business system (Odoo S.A., n.d.). Its relevance to Sako Supply lies in the integration of customer-facing and administrative processes. An order should not exist independently of its inventory effects, fulfillment status, and related transaction records. Connecting these records allows different functions to work from consistent business information.</w:t>
+      </w:r>
+    </w:p>
+    <w:p>
+      <w:pPr>
+        <w:jc w:val="both"/>
+      </w:pPr>
+      <w:r>
+        <w:t>Sako Supply applies this integration principle within a narrower scope. Its customer interface connects ordering and order history with administrative product management, inventory adjustment, order processing, and reporting. However, the prototype does not provide Odoo’s broader enterprise functions, such as comprehensive accounting, personnel management, or multi-application business operations.</w:t>
+      </w:r>
+    </w:p>
+    <w:p>
+      <w:pPr>
+        <w:pStyle w:val="Heading3"/>
+      </w:pPr>
+      <w:r>
+        <w:t>ERPNext</w:t>
+      </w:r>
+    </w:p>
+    <w:p>
+      <w:pPr>
+        <w:jc w:val="both"/>
+      </w:pPr>
+      <w:r>
+        <w:t>ERPNext is an open-source enterprise resource planning system. Its official documentation identifies order-management functions involving inventory levels, stock replenishment, sales orders, shipments, and fulfillment, alongside accounting and other business applications (Frappe Technologies, n.d.). ERPNext is relevant to the study because it illustrates the relationship between stock records and the processing of customer orders. This relationship supports the inclusion of stock validation, reservation, cancellation-based restoration, reorder points, and stock-adjustment histories in Sako Supply.</w:t>
+      </w:r>
+    </w:p>
+    <w:p>
+      <w:pPr>
+        <w:jc w:val="both"/>
+      </w:pPr>
+      <w:r>
+        <w:t>The comparison also helps define the prototype’s limitations. Sako Supply records order totals and administrator-entered cash collections, but these functions do not constitute a complete accounting system. Its reports should not be interpreted as audited financial statements, verified profit calculations, or independent proof of collected revenue.</w:t>
+      </w:r>
+    </w:p>
+    <w:p>
+      <w:pPr>
+        <w:pStyle w:val="Heading3"/>
+      </w:pPr>
+      <w:r>
+        <w:t>Medusa</w:t>
+      </w:r>
+    </w:p>
+    <w:p>
+      <w:pPr>
+        <w:jc w:val="both"/>
+      </w:pPr>
+      <w:r>
+        <w:t>Medusa describes a modular commerce platform with capabilities involving products, carts, orders, pricing, and payments. Its official repository also presents business-to-business stores and distributor applications as possible uses of its commerce components (Medusa, n.d.). Medusa is relevant to Sako Supply’s architecture because it illustrates the separation of commerce responsibilities into organized components. In Sako Supply, account management, catalog operations, orders, pricing, tracking, and reporting are handled through separate application modules.</w:t>
+      </w:r>
+    </w:p>
+    <w:p>
+      <w:pPr>
+        <w:jc w:val="both"/>
+      </w:pPr>
+      <w:r>
+        <w:t>This separation can make the prototype easier to explain, maintain, and test. However, modular organization alone does not establish production readiness, scalability, or security. Sako Supply remains a smaller implementation with local SQLite storage and explicitly demonstrated electronic payments rather than a complete enterprise commerce platform.</w:t>
       </w:r>
     </w:p>
     <w:p>
@@ -943,7 +1127,7 @@
         <w:rPr>
           <w:i/>
         </w:rPr>
-        <w:t>Table 1.2. Documentary comparison of related systems and Sako Supply</w:t>
+        <w:t>Table 1.2. Comparison of related systems and Sako Supply</w:t>
       </w:r>
     </w:p>
     <w:tbl>
@@ -1015,7 +1199,7 @@
                 <w:b/>
                 <w:sz w:val="18"/>
               </w:rPr>
-              <w:t>Relevance and scope difference</w:t>
+              <w:t>Relevance to Sako Supply</w:t>
             </w:r>
           </w:p>
         </w:tc>
@@ -1056,7 +1240,7 @@
                 <w:b w:val="0"/>
                 <w:sz w:val="18"/>
               </w:rPr>
-              <w:t>WordPress commerce, products, carts, extensibility</w:t>
+              <w:t>Product presentation, carts, checkout, and extensibility</w:t>
             </w:r>
           </w:p>
         </w:tc>
@@ -1074,7 +1258,7 @@
                 <w:b w:val="0"/>
                 <w:sz w:val="18"/>
               </w:rPr>
-              <w:t>Reference for catalog-to-checkout flow; rice-specific rules would require store configuration/customization.</w:t>
+              <w:t>Reference for connecting the catalog to customer ordering and administration.</w:t>
             </w:r>
           </w:p>
         </w:tc>
@@ -1115,7 +1299,7 @@
                 <w:b w:val="0"/>
                 <w:sz w:val="18"/>
               </w:rPr>
-              <w:t>Integrated web business applications including commerce and warehouse management</w:t>
+              <w:t>Integration of commerce, inventory, and broader business applications</w:t>
             </w:r>
           </w:p>
         </w:tc>
@@ -1133,7 +1317,7 @@
                 <w:b w:val="0"/>
                 <w:sz w:val="18"/>
               </w:rPr>
-              <w:t>Reference for linking customer and administrative functions; broader ERP scope is outside this prototype.</w:t>
+              <w:t>Reference for linking customer and administrative processes through consistent records.</w:t>
             </w:r>
           </w:p>
         </w:tc>
@@ -1174,7 +1358,7 @@
                 <w:b w:val="0"/>
                 <w:sz w:val="18"/>
               </w:rPr>
-              <w:t>Stock-related order management and accounting tools</w:t>
+              <w:t>Inventory-related order management, fulfillment, and accounting</w:t>
             </w:r>
           </w:p>
         </w:tc>
@@ -1192,7 +1376,7 @@
                 <w:b w:val="0"/>
                 <w:sz w:val="18"/>
               </w:rPr>
-              <w:t>Reference for stock/order relationships; Sako Supply provides a limited order and cash-recording workflow.</w:t>
+              <w:t>Reference for stock-and-order relationships; Sako Supply’s financial records remain limited.</w:t>
             </w:r>
           </w:p>
         </w:tc>
@@ -1233,7 +1417,7 @@
                 <w:b w:val="0"/>
                 <w:sz w:val="18"/>
               </w:rPr>
-              <w:t>Modular commerce building blocks and customizable API/application structure</w:t>
+              <w:t>Modular commerce components and customizable architecture</w:t>
             </w:r>
           </w:p>
         </w:tc>
@@ -1251,7 +1435,7 @@
                 <w:b w:val="0"/>
                 <w:sz w:val="18"/>
               </w:rPr>
-              <w:t>Reference for separating application responsibilities; external production providers are not connected in Sako Supply.</w:t>
+              <w:t>Reference for separating catalog, account, order, pricing, and reporting responsibilities.</w:t>
             </w:r>
           </w:p>
         </w:tc>
@@ -1292,7 +1476,7 @@
                 <w:b w:val="0"/>
                 <w:sz w:val="18"/>
               </w:rPr>
-              <w:t>Single bigasan, 25 kg sacks, sample tiers/zones, inventory reservation</w:t>
+              <w:t>Single-store rice ordering, 25 kg sacks, wholesale rules, scheduling, and reservation</w:t>
             </w:r>
           </w:p>
         </w:tc>
@@ -1310,7 +1494,7 @@
                 <w:b w:val="0"/>
                 <w:sz w:val="18"/>
               </w:rPr>
-              <w:t>Focused academic configuration with clearly labeled payment/map simulations and documented technical tests.</w:t>
+              <w:t>Focused academic prototype with demonstrated payments and consent-based driver-location sharing.</w:t>
             </w:r>
           </w:p>
         </w:tc>
@@ -1322,7 +1506,7 @@
         <w:pStyle w:val="Heading3"/>
       </w:pPr>
       <w:r>
-        <w:t>1.7.5 Technical Guidance and Synthesis</w:t>
+        <w:t>1.7.6 Technical Guidance Relevant to the Study</w:t>
       </w:r>
     </w:p>
     <w:p>
@@ -1330,7 +1514,7 @@
         <w:jc w:val="both"/>
       </w:pPr>
       <w:r>
-        <w:t>OWASP’s Authentication Cheat Sheet distinguishes identity verification from session management and recommends deliberate password and authentication controls (OWASP Foundation, n.d.). The prototype uses salted password hashing, server-managed sessions, failed-login limits, and authorization checks. Nevertheless, its demo administrator password, absence of email verification and multifactor authentication, and limited security evaluation mean that full conformance with production authentication guidance must not be claimed.</w:t>
+        <w:t>The OWASP Authentication Cheat Sheet provides guidance on authentication controls, including password handling and protection against abusive authentication attempts (OWASP Foundation, n.d.). This guidance is relevant to Sako Supply because customer records, orders, administrative functions, and recovery procedures require controlled access.</w:t>
       </w:r>
     </w:p>
     <w:p>
@@ -1338,7 +1522,7 @@
         <w:jc w:val="both"/>
       </w:pPr>
       <w:r>
-        <w:t>Node.js documents the node:sqlite interface used for local SQL access (Node.js contributors, n.d.). The study relies on integer-centavo calculations, parameterized SQL, and transactions for the ordering workflow. The executed last-sack concurrency test provides evidence for a specific inventory behavior in the implementation, not a general guarantee about every deployment or load condition.</w:t>
+        <w:t>The prototype includes salted password hashing, server-managed sessions, failed-login limits, and authorization checks. It also provides administrator-assisted password recovery and optional email-verification and recovery functions that require a configured email provider. These features should be evaluated through the application’s actual access-control and recovery tests. Their presence does not establish full compliance with all OWASP recommendations or eliminate the need for deployment-specific security review.</w:t>
       </w:r>
     </w:p>
     <w:p>
@@ -1346,7 +1530,55 @@
         <w:jc w:val="both"/>
       </w:pPr>
       <w:r>
-        <w:t>The reviewed systems establish that commerce, inventory, and administrative information can be connected. The contribution of this project is a focused, explainable prototype and evaluation plan for the specified rice-ordering context. It is not a claim that existing systems lack the capability to serve rice stores. The five objectives therefore remain the basis for the requirements and procedures developed in Chapter II.</w:t>
+        <w:t>Node.js documentation describes the node:sqlite interface used by the application for SQL database access (Node.js contributors, n.d.). Sako Supply uses parameterized statements and transactions to manage related ordering and inventory operations. Integer-centavo calculations are used for monetary computations. These technical sources support implementation choices, but they are not substitutes for academic literature or evidence from the study’s evaluation. For example, a successful transaction test demonstrates a particular tested behavior; it does not guarantee correct operation under every workload, hosting environment, or failure condition.</w:t>
+      </w:r>
+    </w:p>
+    <w:p>
+      <w:pPr>
+        <w:pStyle w:val="Heading3"/>
+      </w:pPr>
+      <w:r>
+        <w:t>1.7.7 Synthesis and Relevance to the Present Study</w:t>
+      </w:r>
+    </w:p>
+    <w:p>
+      <w:pPr>
+        <w:jc w:val="both"/>
+      </w:pPr>
+      <w:r>
+        <w:t>The reviewed literature identifies several considerations relevant to Sako Supply. DeLone and McLean (2003) provide a basis for examining system quality, information quality, and user satisfaction. Davis (1989) supports evaluating usefulness and ease of use. Gefen et al. (2003) provide a basis for considering trust and transparency in online shopping. DeHoratius and Raman (2008) emphasize the importance of distinguishing recorded inventory from physical stock.</w:t>
+      </w:r>
+    </w:p>
+    <w:p>
+      <w:pPr>
+        <w:jc w:val="both"/>
+      </w:pPr>
+      <w:r>
+        <w:t>The related systems show established approaches to combining commerce, inventory, and administrative functions. WooCommerce illustrates the storefront-to-checkout relationship; Odoo illustrates business-process integration; ERPNext illustrates stock-related order management; and Medusa illustrates modular commerce architecture.</w:t>
+      </w:r>
+    </w:p>
+    <w:p>
+      <w:pPr>
+        <w:jc w:val="both"/>
+      </w:pPr>
+      <w:r>
+        <w:t>The contribution of Sako Supply is therefore its focused application and evaluation in a specified rice-wholesale context, rather than the invention of electronic commerce or a claim that existing platforms cannot serve bigasan businesses. Its current implementation combines 25 kg rice ordering, configurable minimum quantities, bulk pricing, delivery zones and schedules, inventory reservations, customer transaction records, administrative monitoring, and consent-based delivery acknowledgments. Its electronic payments remain demonstrations, while device-location tracking depends on an assigned driver actively sharing location (Abdulhakim, 2026).</w:t>
+      </w:r>
+    </w:p>
+    <w:p>
+      <w:pPr>
+        <w:jc w:val="both"/>
+      </w:pPr>
+      <w:r>
+        <w:t>These considerations connect the three chapters of the study. Chapter I establishes the ordering, inventory, transaction-visibility, administrative, and evaluation objectives. Chapter II should translate the reviewed concepts into requirements, design decisions, test cases, and user-evaluation procedures. Chapter III should identify the corresponding system outputs and the evidence used to assess them.</w:t>
+      </w:r>
+    </w:p>
+    <w:p>
+      <w:pPr>
+        <w:jc w:val="both"/>
+      </w:pPr>
+      <w:r>
+        <w:t>For example, information accuracy can be examined through price, stock, and receipt-reconciliation tests. Inventory consistency can be examined through competing-order, cancellation, and reservation-expiry tests. Ease of use and clarity can be examined through customer and administrative tasks. Conclusions about satisfaction, usefulness, trust, or business improvement must be based on documented evaluation results rather than inferred solely from the existence of system features.</w:t>
       </w:r>
     </w:p>
     <w:p>
@@ -7165,7 +7397,34 @@
         <w:jc w:val="both"/>
       </w:pPr>
       <w:r>
-        <w:t>Abdulhakim, H. N. (2026). Sako Supply: A web-based wholesale rice ordering and inventory management system [Unpublished academic prototype; repository checkpoint e711837]. https://github.com/xynvm120/Sako-Supply/tree/e711837af0c6659094afa84392b479a0b944f7ed</w:t>
+        <w:t>Abdulhakim, H. N. (2026). Sako Supply: A web-based wholesale rice ordering and inventory management system [Unpublished academic prototype; original analysis e711837, RRL update 281bf78]. https://github.com/xynvm120/Sako-Supply/tree/281bf783b26da72b88518f1e8427afc78a6b3266</w:t>
+      </w:r>
+    </w:p>
+    <w:p>
+      <w:pPr>
+        <w:ind w:hanging="504" w:left="504"/>
+        <w:jc w:val="both"/>
+      </w:pPr>
+      <w:r>
+        <w:t>Davis, F. D. (1989). Perceived usefulness, perceived ease of use, and user acceptance of information technology. MIS Quarterly, 13(3), 319–340. https://doi.org/10.2307/249008</w:t>
+      </w:r>
+    </w:p>
+    <w:p>
+      <w:pPr>
+        <w:ind w:hanging="504" w:left="504"/>
+        <w:jc w:val="both"/>
+      </w:pPr>
+      <w:r>
+        <w:t>DeHoratius, N., &amp; Raman, A. (2008). Inventory record inaccuracy: An empirical analysis. Management Science, 54(4), 627–641. https://doi.org/10.1287/mnsc.1070.0789</w:t>
+      </w:r>
+    </w:p>
+    <w:p>
+      <w:pPr>
+        <w:ind w:hanging="504" w:left="504"/>
+        <w:jc w:val="both"/>
+      </w:pPr>
+      <w:r>
+        <w:t>DeLone, W. H., &amp; McLean, E. R. (2003). The DeLone and McLean model of information systems success: A ten-year update. Journal of Management Information Systems, 19(4), 9–30. https://doi.org/10.1080/07421222.2003.11045748</w:t>
       </w:r>
     </w:p>
     <w:p>
@@ -7183,6 +7442,15 @@
         <w:jc w:val="both"/>
       </w:pPr>
       <w:r>
+        <w:t>Gefen, D., Karahanna, E., &amp; Straub, D. W. (2003). Trust and TAM in online shopping: An integrated model. MIS Quarterly, 27(1), 51–90. https://doi.org/10.2307/30036519</w:t>
+      </w:r>
+    </w:p>
+    <w:p>
+      <w:pPr>
+        <w:ind w:hanging="504" w:left="504"/>
+        <w:jc w:val="both"/>
+      </w:pPr>
+      <w:r>
         <w:t>Medusa. (n.d.). Medusa [Computer software]. GitHub. https://github.com/medusajs/medusa</w:t>
       </w:r>
     </w:p>
@@ -7227,7 +7495,7 @@
         <w:jc w:val="both"/>
       </w:pPr>
       <w:r>
-        <w:t>Source note: The related-system descriptions were checked against official project repositories or their official readme material. The supporting Node.js and OWASP documentation was also retrieved for review. These are software/documentary sources, not invented peer-reviewed or local field studies. The researcher should confirm the instructor’s required citation style and add verified local studies if specifically required.</w:t>
+        <w:t>Source note: The related-system descriptions use official project repositories/readme material, and Node.js and OWASP provide supporting technical documentation. The four journal articles are foundational references, not recent Philippine rice-store field studies. Full-text academic-source access was blocked during this revision; the researcher must consult the DOI-linked articles through a library and confirm their interpretation before final submission. No quotations, numerical study findings, local respondents, or acceptance scores have been invented.</w:t>
       </w:r>
     </w:p>
     <w:p>

</xml_diff>